<commit_message>
Documentation improved post release
</commit_message>
<xml_diff>
--- a/documents/SENG BİTİRME PROJESİ RAPOR TASLAĞI.docx
+++ b/documents/SENG BİTİRME PROJESİ RAPOR TASLAĞI.docx
@@ -271,13 +271,7 @@
               <w:rPr>
                 <w:lang w:val="en-GB"/>
               </w:rPr>
-              <w:t>—</w:t>
-            </w:r>
-            <w:r>
-              <w:rPr>
-                <w:lang w:val="en-GB"/>
-              </w:rPr>
-              <w:t xml:space="preserve"> </w:t>
+              <w:t xml:space="preserve">— </w:t>
             </w:r>
             <w:r>
               <w:rPr>
@@ -642,7 +636,7 @@
           <w:sz w:val="24"/>
           <w:szCs w:val="24"/>
         </w:rPr>
-        <w:t>I would like to express my deepest appreciation to all those who provided me the possibility to complete this project.  A special gratitude I give to our senior project supervisor, Mr..….., (Change it as you wish)</w:t>
+        <w:t>I would like to express my sincere gratitude to my project supervisor, Dr. Aytun Onay, for his invaluable guidance, encouragement, and continuous support throughout the course of this project. His expertise, insightful feedback, and constructive suggestions were instrumental in shaping both the direction and the quality of this work. I amalso thankful to the other academicians at the university who contributed through discussions, lectures, and academic resources that helped strengthen my understanding of operating systems, kernel development, and performance optimization. Their dedication to teaching and research provided a strong academic foundation for this project. Special appreciation is extended to the broader research and developer community working in the area of Linux scheduling and kernel development. The contributions of researchers, maintainers, and open-source developers—through documentation, publications, mailing lists, and code repositories—were essential in enabling practical experimentation and informed design decisions. Their ongoing efforts to advance the Linux scheduler ecosystem served as both a technical reference and a source of inspiration. Finally, I would like to thank all individuals, colleagues, and peers who offered support, feedback, and motivation during the development of this project. Their assistance and encouragement were greatly appreciated.</w:t>
       </w:r>
       <w:r>
         <w:br w:type="page"/>
@@ -20287,6 +20281,7 @@
   <w:style w:type="character" w:default="1" w:styleId="DefaultParagraphFont">
     <w:name w:val="Default Paragraph Font"/>
     <w:uiPriority w:val="1"/>
+    <w:semiHidden/>
     <w:unhideWhenUsed/>
   </w:style>
   <w:style w:type="table" w:default="1" w:styleId="TableNormal">
@@ -21728,6 +21723,15 @@
 </file>
 
 <file path=customXml/item1.xml><?xml version="1.0" encoding="utf-8"?>
+<?mso-contentType ?>
+<FormTemplates xmlns="http://schemas.microsoft.com/sharepoint/v3/contenttype/forms">
+  <Display>DocumentLibraryForm</Display>
+  <Edit>DocumentLibraryForm</Edit>
+  <New>DocumentLibraryForm</New>
+</FormTemplates>
+</file>
+
+<file path=customXml/item2.xml><?xml version="1.0" encoding="utf-8"?>
 <p:properties xmlns:p="http://schemas.microsoft.com/office/2006/metadata/properties" xmlns:xsi="http://www.w3.org/2001/XMLSchema-instance" xmlns:pc="http://schemas.microsoft.com/office/infopath/2007/PartnerControls">
   <documentManagement>
     <lcf76f155ced4ddcb4097134ff3c332f xmlns="7e9bba26-c7b2-4a27-a3ac-cd76b284cae0">
@@ -21738,16 +21742,13 @@
 </p:properties>
 </file>
 
-<file path=customXml/item2.xml><?xml version="1.0" encoding="utf-8"?>
-<?mso-contentType ?>
-<FormTemplates xmlns="http://schemas.microsoft.com/sharepoint/v3/contenttype/forms">
-  <Display>DocumentLibraryForm</Display>
-  <Edit>DocumentLibraryForm</Edit>
-  <New>DocumentLibraryForm</New>
-</FormTemplates>
+<file path=customXml/item3.xml><?xml version="1.0" encoding="utf-8"?>
+<go:gDocsCustomXmlDataStorage xmlns:go="http://customooxmlschemas.google.com/" xmlns:r="http://schemas.openxmlformats.org/officeDocument/2006/relationships" uri="GoogleDocsCustomDataVersion2">
+  <go:docsCustomData xmlns:go="http://customooxmlschemas.google.com/" roundtripDataSignature="AMtx7mjWy5EO6kt5atv+NXw3Gu3Sl74eEA==">CgMxLjA4AHIhMWgzWVFPeDRiaDdneGFvQmZGdkUzUnk1V2w0QTd4VW0x</go:docsCustomData>
+</go:gDocsCustomXmlDataStorage>
 </file>
 
-<file path=customXml/item3.xml><?xml version="1.0" encoding="utf-8"?>
+<file path=customXml/item4.xml><?xml version="1.0" encoding="utf-8"?>
 <ct:contentTypeSchema xmlns:ct="http://schemas.microsoft.com/office/2006/metadata/contentType" xmlns:ma="http://schemas.microsoft.com/office/2006/metadata/properties/metaAttributes" ct:_="" ma:_="" ma:contentTypeName="Belge" ma:contentTypeID="0x010100A2D9663D32F195478084E660A9F44C9E" ma:contentTypeVersion="10" ma:contentTypeDescription="Yeni belge oluşturun." ma:contentTypeScope="" ma:versionID="6d98bf1c7ffb5fb69278a9c6338486c7">
   <xsd:schema xmlns:xsd="http://www.w3.org/2001/XMLSchema" xmlns:xs="http://www.w3.org/2001/XMLSchema" xmlns:p="http://schemas.microsoft.com/office/2006/metadata/properties" xmlns:ns2="7e9bba26-c7b2-4a27-a3ac-cd76b284cae0" xmlns:ns3="f76e5be2-97eb-4a1b-ab44-72f8057eaa93" targetNamespace="http://schemas.microsoft.com/office/2006/metadata/properties" ma:root="true" ma:fieldsID="508632a5764188408bb22ca1c81e76c3" ns2:_="" ns3:_="">
     <xsd:import namespace="7e9bba26-c7b2-4a27-a3ac-cd76b284cae0"/>
@@ -21936,13 +21937,15 @@
 </ct:contentTypeSchema>
 </file>
 
-<file path=customXml/item4.xml><?xml version="1.0" encoding="utf-8"?>
-<go:gDocsCustomXmlDataStorage xmlns:go="http://customooxmlschemas.google.com/" xmlns:r="http://schemas.openxmlformats.org/officeDocument/2006/relationships" uri="GoogleDocsCustomDataVersion2">
-  <go:docsCustomData xmlns:go="http://customooxmlschemas.google.com/" roundtripDataSignature="AMtx7mjWy5EO6kt5atv+NXw3Gu3Sl74eEA==">CgMxLjA4AHIhMWgzWVFPeDRiaDdneGFvQmZGdkUzUnk1V2w0QTd4VW0x</go:docsCustomData>
-</go:gDocsCustomXmlDataStorage>
+<file path=customXml/itemProps1.xml><?xml version="1.0" encoding="utf-8"?>
+<ds:datastoreItem xmlns:ds="http://schemas.openxmlformats.org/officeDocument/2006/customXml" ds:itemID="{E746D0E6-B458-4401-BBA2-205116D38250}">
+  <ds:schemaRefs>
+    <ds:schemaRef ds:uri="http://schemas.microsoft.com/sharepoint/v3/contenttype/forms"/>
+  </ds:schemaRefs>
+</ds:datastoreItem>
 </file>
 
-<file path=customXml/itemProps1.xml><?xml version="1.0" encoding="utf-8"?>
+<file path=customXml/itemProps2.xml><?xml version="1.0" encoding="utf-8"?>
 <ds:datastoreItem xmlns:ds="http://schemas.openxmlformats.org/officeDocument/2006/customXml" ds:itemID="{E5F80975-576A-46B4-A30D-917CC465C2C2}">
   <ds:schemaRefs>
     <ds:schemaRef ds:uri="http://schemas.microsoft.com/office/2006/metadata/properties"/>
@@ -21953,15 +21956,16 @@
 </ds:datastoreItem>
 </file>
 
-<file path=customXml/itemProps2.xml><?xml version="1.0" encoding="utf-8"?>
-<ds:datastoreItem xmlns:ds="http://schemas.openxmlformats.org/officeDocument/2006/customXml" ds:itemID="{E746D0E6-B458-4401-BBA2-205116D38250}">
+<file path=customXml/itemProps3.xml><?xml version="1.0" encoding="utf-8"?>
+<ds:datastoreItem xmlns:ds="http://schemas.openxmlformats.org/officeDocument/2006/customXml" ds:itemID="{11111111-1234-1234-1234-123412341234}">
   <ds:schemaRefs>
-    <ds:schemaRef ds:uri="http://schemas.microsoft.com/sharepoint/v3/contenttype/forms"/>
+    <ds:schemaRef ds:uri="http://customooxmlschemas.google.com/"/>
+    <ds:schemaRef ds:uri="http://schemas.openxmlformats.org/officeDocument/2006/relationships"/>
   </ds:schemaRefs>
 </ds:datastoreItem>
 </file>
 
-<file path=customXml/itemProps3.xml><?xml version="1.0" encoding="utf-8"?>
+<file path=customXml/itemProps4.xml><?xml version="1.0" encoding="utf-8"?>
 <ds:datastoreItem xmlns:ds="http://schemas.openxmlformats.org/officeDocument/2006/customXml" ds:itemID="{F9C39193-FFC5-4D89-94FB-36EF51BE6022}">
   <ds:schemaRefs>
     <ds:schemaRef ds:uri="http://schemas.microsoft.com/office/2006/metadata/contentType"/>
@@ -21978,13 +21982,4 @@
     <ds:schemaRef ds:uri="http://schemas.microsoft.com/internal/obd"/>
   </ds:schemaRefs>
 </ds:datastoreItem>
-</file>
-
-<file path=customXml/itemProps4.xml><?xml version="1.0" encoding="utf-8"?>
-<ds:datastoreItem xmlns:ds="http://schemas.openxmlformats.org/officeDocument/2006/customXml" ds:itemID="{11111111-1234-1234-1234-123412341234}">
-  <ds:schemaRefs>
-    <ds:schemaRef ds:uri="http://customooxmlschemas.google.com/"/>
-    <ds:schemaRef ds:uri="http://schemas.openxmlformats.org/officeDocument/2006/relationships"/>
-  </ds:schemaRefs>
-</ds:datastoreItem>
 </file>
</xml_diff>

<commit_message>
Literature Review Updated by 1 Row
</commit_message>
<xml_diff>
--- a/documents/SENG BİTİRME PROJESİ RAPOR TASLAĞI.docx
+++ b/documents/SENG BİTİRME PROJESİ RAPOR TASLAĞI.docx
@@ -10362,6 +10362,7 @@
     <w:p>
       <w:pPr>
         <w:pStyle w:val="ListParagraph"/>
+        <w:spacing w:line="360" w:lineRule="auto"/>
         <w:rPr>
           <w:color w:val="000000"/>
           <w:sz w:val="24"/>
@@ -10395,6 +10396,7 @@
     <w:p>
       <w:pPr>
         <w:pStyle w:val="ListParagraph"/>
+        <w:spacing w:line="360" w:lineRule="auto"/>
         <w:rPr>
           <w:color w:val="000000"/>
           <w:sz w:val="24"/>
@@ -10428,6 +10430,7 @@
     <w:p>
       <w:pPr>
         <w:pStyle w:val="ListParagraph"/>
+        <w:spacing w:line="360" w:lineRule="auto"/>
         <w:rPr>
           <w:color w:val="000000"/>
           <w:sz w:val="24"/>
@@ -10461,6 +10464,7 @@
     <w:p>
       <w:pPr>
         <w:pStyle w:val="ListParagraph"/>
+        <w:spacing w:line="360" w:lineRule="auto"/>
         <w:rPr>
           <w:color w:val="000000"/>
           <w:sz w:val="24"/>
@@ -10494,6 +10498,7 @@
     <w:p>
       <w:pPr>
         <w:pStyle w:val="ListParagraph"/>
+        <w:spacing w:line="360" w:lineRule="auto"/>
         <w:rPr>
           <w:color w:val="000000"/>
           <w:sz w:val="24"/>
@@ -10527,6 +10532,7 @@
     <w:p>
       <w:pPr>
         <w:pStyle w:val="ListParagraph"/>
+        <w:spacing w:line="360" w:lineRule="auto"/>
         <w:rPr>
           <w:color w:val="000000"/>
           <w:sz w:val="24"/>
@@ -10569,14 +10575,64 @@
     </w:p>
     <w:p>
       <w:pPr>
+        <w:numPr>
+          <w:ilvl w:val="0"/>
+          <w:numId w:val="25"/>
+        </w:numPr>
+        <w:spacing w:before="100" w:beforeAutospacing="1" w:after="100" w:afterAutospacing="1" w:line="360" w:lineRule="auto"/>
+        <w:rPr>
+          <w:rFonts w:asciiTheme="minorHAnsi" w:eastAsia="Times New Roman" w:hAnsiTheme="minorHAnsi" w:cstheme="minorHAnsi"/>
+          <w:color w:val="auto"/>
+          <w:kern w:val="0"/>
+          <w:sz w:val="24"/>
+          <w:szCs w:val="24"/>
+          <w:lang w:val="en-GB" w:eastAsia="ja-JP"/>
+        </w:rPr>
+      </w:pPr>
+      <w:r>
+        <w:rPr>
+          <w:rFonts w:asciiTheme="minorHAnsi" w:eastAsia="Times New Roman" w:hAnsiTheme="minorHAnsi" w:cstheme="minorHAnsi"/>
+          <w:color w:val="auto"/>
+          <w:kern w:val="0"/>
+          <w:sz w:val="24"/>
+          <w:szCs w:val="24"/>
+          <w:lang w:val="en-GB" w:eastAsia="ja-JP"/>
+        </w:rPr>
+        <w:t>Bilodeau-Savaria, C.-E., Nidzwetzki, J.K., Scherzinger, S. and Kemme, B. (2026) ‘Unfair by design: eBPF-based scheduling of mixed database workloads’, arXiv preprint arXiv:2605.02377.</w:t>
+      </w:r>
+    </w:p>
+    <w:p>
+      <w:pPr>
         <w:spacing w:after="0" w:line="360" w:lineRule="auto"/>
+        <w:ind w:left="360"/>
         <w:rPr>
           <w:color w:val="000000"/>
           <w:sz w:val="24"/>
           <w:szCs w:val="24"/>
         </w:rPr>
       </w:pPr>
-      <w:r>
+    </w:p>
+    <w:p>
+      <w:pPr>
+        <w:spacing w:after="0" w:line="360" w:lineRule="auto"/>
+        <w:rPr>
+          <w:color w:val="000000"/>
+          <w:sz w:val="24"/>
+          <w:szCs w:val="24"/>
+        </w:rPr>
+      </w:pPr>
+    </w:p>
+    <w:p>
+      <w:pPr>
+        <w:spacing w:after="0" w:line="360" w:lineRule="auto"/>
+        <w:rPr>
+          <w:color w:val="000000"/>
+          <w:sz w:val="24"/>
+          <w:szCs w:val="24"/>
+        </w:rPr>
+      </w:pPr>
+      <w:r>
+        <w:lastRenderedPageBreak/>
         <w:br w:type="page"/>
       </w:r>
     </w:p>
@@ -20318,6 +20374,119 @@
     </w:lvl>
   </w:abstractNum>
   <w:abstractNum w:abstractNumId="26" w15:restartNumberingAfterBreak="0">
+    <w:nsid w:val="734E5905"/>
+    <w:multiLevelType w:val="multilevel"/>
+    <w:tmpl w:val="9C40DD6A"/>
+    <w:lvl w:ilvl="0">
+      <w:start w:val="16"/>
+      <w:numFmt w:val="decimal"/>
+      <w:lvlText w:val="%1."/>
+      <w:lvlJc w:val="left"/>
+      <w:pPr>
+        <w:tabs>
+          <w:tab w:val="num" w:pos="720"/>
+        </w:tabs>
+        <w:ind w:left="720" w:hanging="360"/>
+      </w:pPr>
+    </w:lvl>
+    <w:lvl w:ilvl="1" w:tentative="1">
+      <w:start w:val="1"/>
+      <w:numFmt w:val="decimal"/>
+      <w:lvlText w:val="%2."/>
+      <w:lvlJc w:val="left"/>
+      <w:pPr>
+        <w:tabs>
+          <w:tab w:val="num" w:pos="1440"/>
+        </w:tabs>
+        <w:ind w:left="1440" w:hanging="360"/>
+      </w:pPr>
+    </w:lvl>
+    <w:lvl w:ilvl="2" w:tentative="1">
+      <w:start w:val="1"/>
+      <w:numFmt w:val="decimal"/>
+      <w:lvlText w:val="%3."/>
+      <w:lvlJc w:val="left"/>
+      <w:pPr>
+        <w:tabs>
+          <w:tab w:val="num" w:pos="2160"/>
+        </w:tabs>
+        <w:ind w:left="2160" w:hanging="360"/>
+      </w:pPr>
+    </w:lvl>
+    <w:lvl w:ilvl="3" w:tentative="1">
+      <w:start w:val="1"/>
+      <w:numFmt w:val="decimal"/>
+      <w:lvlText w:val="%4."/>
+      <w:lvlJc w:val="left"/>
+      <w:pPr>
+        <w:tabs>
+          <w:tab w:val="num" w:pos="2880"/>
+        </w:tabs>
+        <w:ind w:left="2880" w:hanging="360"/>
+      </w:pPr>
+    </w:lvl>
+    <w:lvl w:ilvl="4" w:tentative="1">
+      <w:start w:val="1"/>
+      <w:numFmt w:val="decimal"/>
+      <w:lvlText w:val="%5."/>
+      <w:lvlJc w:val="left"/>
+      <w:pPr>
+        <w:tabs>
+          <w:tab w:val="num" w:pos="3600"/>
+        </w:tabs>
+        <w:ind w:left="3600" w:hanging="360"/>
+      </w:pPr>
+    </w:lvl>
+    <w:lvl w:ilvl="5" w:tentative="1">
+      <w:start w:val="1"/>
+      <w:numFmt w:val="decimal"/>
+      <w:lvlText w:val="%6."/>
+      <w:lvlJc w:val="left"/>
+      <w:pPr>
+        <w:tabs>
+          <w:tab w:val="num" w:pos="4320"/>
+        </w:tabs>
+        <w:ind w:left="4320" w:hanging="360"/>
+      </w:pPr>
+    </w:lvl>
+    <w:lvl w:ilvl="6" w:tentative="1">
+      <w:start w:val="1"/>
+      <w:numFmt w:val="decimal"/>
+      <w:lvlText w:val="%7."/>
+      <w:lvlJc w:val="left"/>
+      <w:pPr>
+        <w:tabs>
+          <w:tab w:val="num" w:pos="5040"/>
+        </w:tabs>
+        <w:ind w:left="5040" w:hanging="360"/>
+      </w:pPr>
+    </w:lvl>
+    <w:lvl w:ilvl="7" w:tentative="1">
+      <w:start w:val="1"/>
+      <w:numFmt w:val="decimal"/>
+      <w:lvlText w:val="%8."/>
+      <w:lvlJc w:val="left"/>
+      <w:pPr>
+        <w:tabs>
+          <w:tab w:val="num" w:pos="5760"/>
+        </w:tabs>
+        <w:ind w:left="5760" w:hanging="360"/>
+      </w:pPr>
+    </w:lvl>
+    <w:lvl w:ilvl="8" w:tentative="1">
+      <w:start w:val="1"/>
+      <w:numFmt w:val="decimal"/>
+      <w:lvlText w:val="%9."/>
+      <w:lvlJc w:val="left"/>
+      <w:pPr>
+        <w:tabs>
+          <w:tab w:val="num" w:pos="6480"/>
+        </w:tabs>
+        <w:ind w:left="6480" w:hanging="360"/>
+      </w:pPr>
+    </w:lvl>
+  </w:abstractNum>
+  <w:abstractNum w:abstractNumId="27" w15:restartNumberingAfterBreak="0">
     <w:nsid w:val="7D6016DB"/>
     <w:multiLevelType w:val="multilevel"/>
     <w:tmpl w:val="0C44EC0A"/>
@@ -20497,7 +20666,7 @@
     <w:abstractNumId w:val="12"/>
   </w:num>
   <w:num w:numId="11" w16cid:durableId="1804958309">
-    <w:abstractNumId w:val="26"/>
+    <w:abstractNumId w:val="27"/>
   </w:num>
   <w:num w:numId="12" w16cid:durableId="996610436">
     <w:abstractNumId w:val="2"/>
@@ -20546,6 +20715,9 @@
   </w:num>
   <w:num w:numId="27" w16cid:durableId="1150293268">
     <w:abstractNumId w:val="20"/>
+  </w:num>
+  <w:num w:numId="28" w16cid:durableId="1978490048">
+    <w:abstractNumId w:val="26"/>
   </w:num>
 </w:numbering>
 </file>
@@ -21165,6 +21337,7 @@
   <w:style w:type="character" w:default="1" w:styleId="DefaultParagraphFont">
     <w:name w:val="Default Paragraph Font"/>
     <w:uiPriority w:val="1"/>
+    <w:semiHidden/>
     <w:unhideWhenUsed/>
   </w:style>
   <w:style w:type="table" w:default="1" w:styleId="TableNormal">
@@ -22606,6 +22779,15 @@
 </file>
 
 <file path=customXml/item1.xml><?xml version="1.0" encoding="utf-8"?>
+<?mso-contentType ?>
+<FormTemplates xmlns="http://schemas.microsoft.com/sharepoint/v3/contenttype/forms">
+  <Display>DocumentLibraryForm</Display>
+  <Edit>DocumentLibraryForm</Edit>
+  <New>DocumentLibraryForm</New>
+</FormTemplates>
+</file>
+
+<file path=customXml/item2.xml><?xml version="1.0" encoding="utf-8"?>
 <p:properties xmlns:p="http://schemas.microsoft.com/office/2006/metadata/properties" xmlns:xsi="http://www.w3.org/2001/XMLSchema-instance" xmlns:pc="http://schemas.microsoft.com/office/infopath/2007/PartnerControls">
   <documentManagement>
     <lcf76f155ced4ddcb4097134ff3c332f xmlns="7e9bba26-c7b2-4a27-a3ac-cd76b284cae0">
@@ -22616,16 +22798,13 @@
 </p:properties>
 </file>
 
-<file path=customXml/item2.xml><?xml version="1.0" encoding="utf-8"?>
-<?mso-contentType ?>
-<FormTemplates xmlns="http://schemas.microsoft.com/sharepoint/v3/contenttype/forms">
-  <Display>DocumentLibraryForm</Display>
-  <Edit>DocumentLibraryForm</Edit>
-  <New>DocumentLibraryForm</New>
-</FormTemplates>
+<file path=customXml/item3.xml><?xml version="1.0" encoding="utf-8"?>
+<go:gDocsCustomXmlDataStorage xmlns:go="http://customooxmlschemas.google.com/" xmlns:r="http://schemas.openxmlformats.org/officeDocument/2006/relationships" uri="GoogleDocsCustomDataVersion2">
+  <go:docsCustomData xmlns:go="http://customooxmlschemas.google.com/" roundtripDataSignature="AMtx7mjWy5EO6kt5atv+NXw3Gu3Sl74eEA==">CgMxLjA4AHIhMWgzWVFPeDRiaDdneGFvQmZGdkUzUnk1V2w0QTd4VW0x</go:docsCustomData>
+</go:gDocsCustomXmlDataStorage>
 </file>
 
-<file path=customXml/item3.xml><?xml version="1.0" encoding="utf-8"?>
+<file path=customXml/item4.xml><?xml version="1.0" encoding="utf-8"?>
 <ct:contentTypeSchema xmlns:ct="http://schemas.microsoft.com/office/2006/metadata/contentType" xmlns:ma="http://schemas.microsoft.com/office/2006/metadata/properties/metaAttributes" ct:_="" ma:_="" ma:contentTypeName="Belge" ma:contentTypeID="0x010100A2D9663D32F195478084E660A9F44C9E" ma:contentTypeVersion="10" ma:contentTypeDescription="Yeni belge oluşturun." ma:contentTypeScope="" ma:versionID="6d98bf1c7ffb5fb69278a9c6338486c7">
   <xsd:schema xmlns:xsd="http://www.w3.org/2001/XMLSchema" xmlns:xs="http://www.w3.org/2001/XMLSchema" xmlns:p="http://schemas.microsoft.com/office/2006/metadata/properties" xmlns:ns2="7e9bba26-c7b2-4a27-a3ac-cd76b284cae0" xmlns:ns3="f76e5be2-97eb-4a1b-ab44-72f8057eaa93" targetNamespace="http://schemas.microsoft.com/office/2006/metadata/properties" ma:root="true" ma:fieldsID="508632a5764188408bb22ca1c81e76c3" ns2:_="" ns3:_="">
     <xsd:import namespace="7e9bba26-c7b2-4a27-a3ac-cd76b284cae0"/>
@@ -22814,13 +22993,15 @@
 </ct:contentTypeSchema>
 </file>
 
-<file path=customXml/item4.xml><?xml version="1.0" encoding="utf-8"?>
-<go:gDocsCustomXmlDataStorage xmlns:go="http://customooxmlschemas.google.com/" xmlns:r="http://schemas.openxmlformats.org/officeDocument/2006/relationships" uri="GoogleDocsCustomDataVersion2">
-  <go:docsCustomData xmlns:go="http://customooxmlschemas.google.com/" roundtripDataSignature="AMtx7mjWy5EO6kt5atv+NXw3Gu3Sl74eEA==">CgMxLjA4AHIhMWgzWVFPeDRiaDdneGFvQmZGdkUzUnk1V2w0QTd4VW0x</go:docsCustomData>
-</go:gDocsCustomXmlDataStorage>
+<file path=customXml/itemProps1.xml><?xml version="1.0" encoding="utf-8"?>
+<ds:datastoreItem xmlns:ds="http://schemas.openxmlformats.org/officeDocument/2006/customXml" ds:itemID="{E746D0E6-B458-4401-BBA2-205116D38250}">
+  <ds:schemaRefs>
+    <ds:schemaRef ds:uri="http://schemas.microsoft.com/sharepoint/v3/contenttype/forms"/>
+  </ds:schemaRefs>
+</ds:datastoreItem>
 </file>
 
-<file path=customXml/itemProps1.xml><?xml version="1.0" encoding="utf-8"?>
+<file path=customXml/itemProps2.xml><?xml version="1.0" encoding="utf-8"?>
 <ds:datastoreItem xmlns:ds="http://schemas.openxmlformats.org/officeDocument/2006/customXml" ds:itemID="{E5F80975-576A-46B4-A30D-917CC465C2C2}">
   <ds:schemaRefs>
     <ds:schemaRef ds:uri="http://schemas.microsoft.com/office/2006/metadata/properties"/>
@@ -22831,15 +23012,16 @@
 </ds:datastoreItem>
 </file>
 
-<file path=customXml/itemProps2.xml><?xml version="1.0" encoding="utf-8"?>
-<ds:datastoreItem xmlns:ds="http://schemas.openxmlformats.org/officeDocument/2006/customXml" ds:itemID="{E746D0E6-B458-4401-BBA2-205116D38250}">
+<file path=customXml/itemProps3.xml><?xml version="1.0" encoding="utf-8"?>
+<ds:datastoreItem xmlns:ds="http://schemas.openxmlformats.org/officeDocument/2006/customXml" ds:itemID="{11111111-1234-1234-1234-123412341234}">
   <ds:schemaRefs>
-    <ds:schemaRef ds:uri="http://schemas.microsoft.com/sharepoint/v3/contenttype/forms"/>
+    <ds:schemaRef ds:uri="http://customooxmlschemas.google.com/"/>
+    <ds:schemaRef ds:uri="http://schemas.openxmlformats.org/officeDocument/2006/relationships"/>
   </ds:schemaRefs>
 </ds:datastoreItem>
 </file>
 
-<file path=customXml/itemProps3.xml><?xml version="1.0" encoding="utf-8"?>
+<file path=customXml/itemProps4.xml><?xml version="1.0" encoding="utf-8"?>
 <ds:datastoreItem xmlns:ds="http://schemas.openxmlformats.org/officeDocument/2006/customXml" ds:itemID="{F9C39193-FFC5-4D89-94FB-36EF51BE6022}">
   <ds:schemaRefs>
     <ds:schemaRef ds:uri="http://schemas.microsoft.com/office/2006/metadata/contentType"/>
@@ -22856,13 +23038,4 @@
     <ds:schemaRef ds:uri="http://schemas.microsoft.com/internal/obd"/>
   </ds:schemaRefs>
 </ds:datastoreItem>
-</file>
-
-<file path=customXml/itemProps4.xml><?xml version="1.0" encoding="utf-8"?>
-<ds:datastoreItem xmlns:ds="http://schemas.openxmlformats.org/officeDocument/2006/customXml" ds:itemID="{11111111-1234-1234-1234-123412341234}">
-  <ds:schemaRefs>
-    <ds:schemaRef ds:uri="http://customooxmlschemas.google.com/"/>
-    <ds:schemaRef ds:uri="http://schemas.openxmlformats.org/officeDocument/2006/relationships"/>
-  </ds:schemaRefs>
-</ds:datastoreItem>
 </file>
</xml_diff>

<commit_message>
Report and Poster Updated
</commit_message>
<xml_diff>
--- a/documents/SENG BİTİRME PROJESİ RAPOR TASLAĞI.docx
+++ b/documents/SENG BİTİRME PROJESİ RAPOR TASLAĞI.docx
@@ -520,7 +520,21 @@
           <w:sz w:val="24"/>
           <w:szCs w:val="24"/>
         </w:rPr>
-        <w:t>, based on the Linux Scheduler Class eXtension (SCX) framework. The system enables users to dynamically switch between multiple schedulers and optionally activate a Machine Learning-based scheduler capable of adapting scheduling decisions according to runtime system behavior.</w:t>
+        <w:t xml:space="preserve">, based on the Linux Scheduler Class eXtension (SCX) framework. The system enables users to dynamically switch between multiple schedulers </w:t>
+      </w:r>
+      <w:r>
+        <w:rPr>
+          <w:sz w:val="24"/>
+          <w:szCs w:val="24"/>
+        </w:rPr>
+        <w:t>by</w:t>
+      </w:r>
+      <w:r>
+        <w:rPr>
+          <w:sz w:val="24"/>
+          <w:szCs w:val="24"/>
+        </w:rPr>
+        <w:t xml:space="preserve"> a Machine Learning-based scheduler capable of adapting scheduling decisions according to runtime system behavior.</w:t>
       </w:r>
     </w:p>
     <w:p>
@@ -581,15 +595,6 @@
       <w:pPr>
         <w:spacing w:line="360" w:lineRule="auto"/>
       </w:pPr>
-    </w:p>
-    <w:p>
-      <w:pPr>
-        <w:spacing w:line="360" w:lineRule="auto"/>
-      </w:pPr>
-      <w:r>
-        <w:lastRenderedPageBreak/>
-        <w:br w:type="page"/>
-      </w:r>
     </w:p>
     <w:p>
       <w:pPr>
@@ -609,7 +614,7 @@
           <w:szCs w:val="28"/>
         </w:rPr>
         <w:lastRenderedPageBreak/>
-        <w:t>Acknowledgements (if any)</w:t>
+        <w:t xml:space="preserve">Acknowledgements </w:t>
       </w:r>
     </w:p>
     <w:p>
@@ -636,7 +641,25 @@
           <w:sz w:val="24"/>
           <w:szCs w:val="24"/>
         </w:rPr>
-        <w:t>I would like to express my sincere gratitude to my project supervisor, Dr. Aytun Onay, for his invaluable guidance, encouragement, and continuous support throughout the course of this project. His expertise, insightful feedback, and constructive suggestions were instrumental in shaping both the direction and the quality of this work. I amalso thankful to the other academicians at the university who contributed through discussions, lectures, and academic resources that helped strengthen my understanding of operating systems, kernel development, and performance optimization. Their dedication to teaching and research provided a strong academic foundation for this project. Special appreciation is extended to the broader research and developer community working in the area of Linux scheduling and kernel development. The contributions of researchers, maintainers, and open-source developers—through documentation, publications, mailing lists, and code repositories—were essential in enabling practical experimentation and informed design decisions. Their ongoing efforts to advance the Linux scheduler ecosystem served as both a technical reference and a source of inspiration. Finally, I would like to thank all individuals, colleagues, and peers who offered support, feedback, and motivation during the development of this project. Their assistance and encouragement were greatly appreciated.</w:t>
+        <w:t>I would like to express my sincere gratitude to my project supervisor, Dr. Aytun Onay, for his invaluable guidance, encouragement, and continuous support throughout the course of this project. His expertise, insightful feedback, and constructive suggestions were instrumental in shaping both the direction and the quality of this work. I am</w:t>
+      </w:r>
+      <w:r>
+        <w:rPr>
+          <w:rFonts w:eastAsia="Calibri" w:cs="Calibri"/>
+          <w:color w:val="000000"/>
+          <w:sz w:val="24"/>
+          <w:szCs w:val="24"/>
+        </w:rPr>
+        <w:t xml:space="preserve"> </w:t>
+      </w:r>
+      <w:r>
+        <w:rPr>
+          <w:rFonts w:eastAsia="Calibri" w:cs="Calibri"/>
+          <w:color w:val="000000"/>
+          <w:sz w:val="24"/>
+          <w:szCs w:val="24"/>
+        </w:rPr>
+        <w:t>also thankful to the other academicians at the university who contributed through discussions, lectures, and academic resources that helped strengthen my understanding of operating systems, kernel development, and performance optimization. Their dedication to teaching and research provided a strong academic foundation for this project. Special appreciation is extended to the broader research and developer community working in the area of Linux scheduling and kernel development. The contributions of researchers, maintainers, and open-source developers—through documentation, publications, mailing lists, and code repositories—were essential in enabling practical experimentation and informed design decisions. Their ongoing efforts to advance the Linux scheduler ecosystem served as both a technical reference and a source of inspiration. Finally, I would like to thank all individuals, colleagues, and peers who offered support, feedback, and motivation during the development of this project. Their assistance and encouragement were greatly appreciated.</w:t>
       </w:r>
       <w:r>
         <w:br w:type="page"/>
@@ -2675,7 +2698,7 @@
           <w:szCs w:val="24"/>
           <w:lang w:val="en-GB"/>
         </w:rPr>
-        <w:t>Runtime scheduler loading and switching.</w:t>
+        <w:t>Machine Learning-based adaptive scheduling.</w:t>
       </w:r>
     </w:p>
     <w:p>
@@ -2703,7 +2726,7 @@
           <w:szCs w:val="24"/>
           <w:lang w:val="en-GB"/>
         </w:rPr>
-        <w:t>Machine Learning-based adaptive scheduling.</w:t>
+        <w:t>Scheduler monitoring and performance analysis.</w:t>
       </w:r>
     </w:p>
     <w:p>
@@ -2731,7 +2754,7 @@
           <w:szCs w:val="24"/>
           <w:lang w:val="en-GB"/>
         </w:rPr>
-        <w:t>Scheduler monitoring and performance analysis.</w:t>
+        <w:t>Scheduler fault detection and recovery.</w:t>
       </w:r>
     </w:p>
     <w:p>
@@ -2759,7 +2782,7 @@
           <w:szCs w:val="24"/>
           <w:lang w:val="en-GB"/>
         </w:rPr>
-        <w:t>Scheduler fault detection and recovery.</w:t>
+        <w:t>Command-line management tools.</w:t>
       </w:r>
     </w:p>
     <w:p>
@@ -2788,34 +2811,6 @@
           <w:lang w:val="en-GB"/>
         </w:rPr>
         <w:lastRenderedPageBreak/>
-        <w:t>Command-line management tools.</w:t>
-      </w:r>
-    </w:p>
-    <w:p>
-      <w:pPr>
-        <w:numPr>
-          <w:ilvl w:val="0"/>
-          <w:numId w:val="9"/>
-        </w:numPr>
-        <w:tabs>
-          <w:tab w:val="left" w:pos="720"/>
-        </w:tabs>
-        <w:spacing w:after="240" w:line="360" w:lineRule="auto"/>
-        <w:jc w:val="both"/>
-        <w:rPr>
-          <w:color w:val="000000"/>
-          <w:sz w:val="24"/>
-          <w:szCs w:val="24"/>
-          <w:lang w:val="en-GB"/>
-        </w:rPr>
-      </w:pPr>
-      <w:r>
-        <w:rPr>
-          <w:color w:val="000000"/>
-          <w:sz w:val="24"/>
-          <w:szCs w:val="24"/>
-          <w:lang w:val="en-GB"/>
-        </w:rPr>
         <w:t>Logging and reporting mechanisms.</w:t>
       </w:r>
     </w:p>
@@ -10624,20 +10619,6 @@
     </w:p>
     <w:p>
       <w:pPr>
-        <w:spacing w:after="0" w:line="360" w:lineRule="auto"/>
-        <w:rPr>
-          <w:color w:val="000000"/>
-          <w:sz w:val="24"/>
-          <w:szCs w:val="24"/>
-        </w:rPr>
-      </w:pPr>
-      <w:r>
-        <w:lastRenderedPageBreak/>
-        <w:br w:type="page"/>
-      </w:r>
-    </w:p>
-    <w:p>
-      <w:pPr>
         <w:pStyle w:val="Heading1"/>
         <w:spacing w:before="0"/>
         <w:rPr>
@@ -11626,6 +11607,7 @@
     <w:p>
       <w:pPr>
         <w:pStyle w:val="BodyText"/>
+        <w:spacing w:line="360" w:lineRule="auto"/>
         <w:rPr>
           <w:sz w:val="24"/>
           <w:szCs w:val="24"/>
@@ -11644,6 +11626,7 @@
     <w:p>
       <w:pPr>
         <w:pStyle w:val="Heading3"/>
+        <w:spacing w:line="360" w:lineRule="auto"/>
         <w:rPr>
           <w:rFonts w:ascii="Calibri" w:eastAsia="Calibri" w:hAnsi="Calibri" w:cs="Calibri"/>
           <w:sz w:val="24"/>
@@ -13067,29 +13050,8 @@
     </w:p>
     <w:p>
       <w:pPr>
-        <w:jc w:val="both"/>
-        <w:rPr>
-          <w:color w:val="000000"/>
-          <w:sz w:val="24"/>
-          <w:szCs w:val="24"/>
-        </w:rPr>
-      </w:pPr>
-      <w:r>
-        <w:rPr>
-          <w:color w:val="000000"/>
-          <w:sz w:val="24"/>
-          <w:szCs w:val="24"/>
-        </w:rPr>
-        <w:t>This section will include the following logical views:</w:t>
-      </w:r>
-    </w:p>
-    <w:p>
-      <w:pPr>
-        <w:numPr>
-          <w:ilvl w:val="0"/>
-          <w:numId w:val="7"/>
-        </w:numPr>
         <w:spacing w:after="0" w:line="360" w:lineRule="auto"/>
+        <w:ind w:left="720"/>
         <w:jc w:val="both"/>
         <w:rPr>
           <w:rFonts w:ascii="Times New Roman" w:eastAsia="Times New Roman" w:hAnsi="Times New Roman" w:cs="Times New Roman"/>
@@ -13101,61 +13063,47 @@
       </w:pPr>
       <w:r>
         <w:rPr>
-          <w:color w:val="000000"/>
-          <w:sz w:val="24"/>
-          <w:szCs w:val="24"/>
-        </w:rPr>
-        <w:t xml:space="preserve">Class diagram (must) </w:t>
-      </w:r>
-    </w:p>
-    <w:p>
-      <w:pPr>
-        <w:numPr>
-          <w:ilvl w:val="0"/>
-          <w:numId w:val="7"/>
-        </w:numPr>
-        <w:spacing w:after="0" w:line="360" w:lineRule="auto"/>
-        <w:jc w:val="both"/>
-        <w:rPr>
           <w:rFonts w:ascii="Times New Roman" w:eastAsia="Times New Roman" w:hAnsi="Times New Roman" w:cs="Times New Roman"/>
           <w:i/>
           <w:color w:val="000000"/>
           <w:sz w:val="24"/>
           <w:szCs w:val="24"/>
         </w:rPr>
-      </w:pPr>
-      <w:r>
-        <w:rPr>
-          <w:color w:val="000000"/>
-          <w:sz w:val="24"/>
-          <w:szCs w:val="24"/>
-        </w:rPr>
-        <w:t>ER Diagram (if needed)</w:t>
-      </w:r>
-    </w:p>
-    <w:p>
-      <w:pPr>
-        <w:numPr>
-          <w:ilvl w:val="0"/>
-          <w:numId w:val="7"/>
-        </w:numPr>
-        <w:spacing w:after="0" w:line="360" w:lineRule="auto"/>
-        <w:jc w:val="both"/>
-        <w:rPr>
-          <w:rFonts w:ascii="Times New Roman" w:eastAsia="Times New Roman" w:hAnsi="Times New Roman" w:cs="Times New Roman"/>
-          <w:i/>
-          <w:color w:val="000000"/>
-          <w:sz w:val="24"/>
-          <w:szCs w:val="24"/>
-        </w:rPr>
-      </w:pPr>
-      <w:r>
-        <w:rPr>
-          <w:color w:val="000000"/>
-          <w:sz w:val="24"/>
-          <w:szCs w:val="24"/>
-        </w:rPr>
-        <w:t>Package Diagram (if needed)</w:t>
+        <w:drawing>
+          <wp:inline distT="0" distB="0" distL="0" distR="0" wp14:anchorId="248046B5" wp14:editId="6ECD48E0">
+            <wp:extent cx="5760720" cy="3694430"/>
+            <wp:effectExtent l="0" t="0" r="0" b="0"/>
+            <wp:docPr id="860116903" name="Picture 1"/>
+            <wp:cNvGraphicFramePr>
+              <a:graphicFrameLocks xmlns:a="http://schemas.openxmlformats.org/drawingml/2006/main" noChangeAspect="1"/>
+            </wp:cNvGraphicFramePr>
+            <a:graphic xmlns:a="http://schemas.openxmlformats.org/drawingml/2006/main">
+              <a:graphicData uri="http://schemas.openxmlformats.org/drawingml/2006/picture">
+                <pic:pic xmlns:pic="http://schemas.openxmlformats.org/drawingml/2006/picture">
+                  <pic:nvPicPr>
+                    <pic:cNvPr id="860116903" name=""/>
+                    <pic:cNvPicPr/>
+                  </pic:nvPicPr>
+                  <pic:blipFill>
+                    <a:blip r:embed="rId18"/>
+                    <a:stretch>
+                      <a:fillRect/>
+                    </a:stretch>
+                  </pic:blipFill>
+                  <pic:spPr>
+                    <a:xfrm>
+                      <a:off x="0" y="0"/>
+                      <a:ext cx="5760720" cy="3694430"/>
+                    </a:xfrm>
+                    <a:prstGeom prst="rect">
+                      <a:avLst/>
+                    </a:prstGeom>
+                  </pic:spPr>
+                </pic:pic>
+              </a:graphicData>
+            </a:graphic>
+          </wp:inline>
+        </w:drawing>
       </w:r>
     </w:p>
     <w:p>
@@ -13208,7 +13156,7 @@
                     </pic:cNvPicPr>
                   </pic:nvPicPr>
                   <pic:blipFill>
-                    <a:blip r:embed="rId18" cstate="print">
+                    <a:blip r:embed="rId19" cstate="print">
                       <a:extLst>
                         <a:ext uri="{28A0092B-C50C-407E-A947-70E740481C1C}">
                           <a14:useLocalDpi xmlns:a14="http://schemas.microsoft.com/office/drawing/2010/main" val="0"/>
@@ -13271,7 +13219,7 @@
                     </pic:cNvPicPr>
                   </pic:nvPicPr>
                   <pic:blipFill>
-                    <a:blip r:embed="rId19" cstate="print">
+                    <a:blip r:embed="rId20" cstate="print">
                       <a:extLst>
                         <a:ext uri="{28A0092B-C50C-407E-A947-70E740481C1C}">
                           <a14:useLocalDpi xmlns:a14="http://schemas.microsoft.com/office/drawing/2010/main" val="0"/>
@@ -13330,7 +13278,7 @@
                     </pic:cNvPicPr>
                   </pic:nvPicPr>
                   <pic:blipFill>
-                    <a:blip r:embed="rId20" cstate="print">
+                    <a:blip r:embed="rId21" cstate="print">
                       <a:extLst>
                         <a:ext uri="{28A0092B-C50C-407E-A947-70E740481C1C}">
                           <a14:useLocalDpi xmlns:a14="http://schemas.microsoft.com/office/drawing/2010/main" val="0"/>
@@ -13445,30 +13393,209 @@
         <w:rPr>
           <w:sz w:val="24"/>
           <w:szCs w:val="24"/>
-        </w:rPr>
-      </w:pPr>
-      <w:r>
-        <w:rPr>
-          <w:sz w:val="24"/>
-          <w:szCs w:val="24"/>
-        </w:rPr>
-        <w:t>In this section, describe and discuss your test procedures (unit tests, integration tests, system tests such as performance tests) and plans. Explain the types of testing employed at each step of the development.</w:t>
-      </w:r>
-    </w:p>
-    <w:p>
-      <w:pPr>
+          <w:lang w:val="en-GB"/>
+        </w:rPr>
+      </w:pPr>
+      <w:r>
+        <w:rPr>
+          <w:sz w:val="24"/>
+          <w:szCs w:val="24"/>
+          <w:lang w:val="en-GB"/>
+        </w:rPr>
+        <w:t>Different testing methods were used to ensure system reliability, stability, and performance.</w:t>
+      </w:r>
+    </w:p>
+    <w:p>
+      <w:pPr>
+        <w:numPr>
+          <w:ilvl w:val="0"/>
+          <w:numId w:val="29"/>
+        </w:numPr>
+        <w:tabs>
+          <w:tab w:val="left" w:pos="720"/>
+        </w:tabs>
         <w:jc w:val="both"/>
         <w:rPr>
           <w:sz w:val="24"/>
           <w:szCs w:val="24"/>
-        </w:rPr>
-      </w:pPr>
-      <w:r>
-        <w:rPr>
-          <w:sz w:val="24"/>
-          <w:szCs w:val="24"/>
-        </w:rPr>
-        <w:t>You should give details about your testing plans, testing procedures and testing results. You should describe the testing purposes as well such as HCI testing, Performance testing etc. You may design some Alpha and Beta testing procedures.</w:t>
+          <w:lang w:val="en-GB"/>
+        </w:rPr>
+      </w:pPr>
+      <w:r>
+        <w:rPr>
+          <w:sz w:val="24"/>
+          <w:szCs w:val="24"/>
+          <w:lang w:val="en-GB"/>
+        </w:rPr>
+        <w:t xml:space="preserve">Unit Testing: Individual modules such as scheduler switching, monitoring, logging, and CLI commands were tested separately. </w:t>
+      </w:r>
+    </w:p>
+    <w:p>
+      <w:pPr>
+        <w:numPr>
+          <w:ilvl w:val="0"/>
+          <w:numId w:val="29"/>
+        </w:numPr>
+        <w:tabs>
+          <w:tab w:val="left" w:pos="720"/>
+        </w:tabs>
+        <w:jc w:val="both"/>
+        <w:rPr>
+          <w:sz w:val="24"/>
+          <w:szCs w:val="24"/>
+          <w:lang w:val="en-GB"/>
+        </w:rPr>
+      </w:pPr>
+      <w:r>
+        <w:rPr>
+          <w:sz w:val="24"/>
+          <w:szCs w:val="24"/>
+          <w:lang w:val="en-GB"/>
+        </w:rPr>
+        <w:t xml:space="preserve">Integration Testing: Communication between schedulers, monitoring systems, ML components, and recovery mechanisms was verified. </w:t>
+      </w:r>
+    </w:p>
+    <w:p>
+      <w:pPr>
+        <w:numPr>
+          <w:ilvl w:val="0"/>
+          <w:numId w:val="29"/>
+        </w:numPr>
+        <w:tabs>
+          <w:tab w:val="left" w:pos="720"/>
+        </w:tabs>
+        <w:jc w:val="both"/>
+        <w:rPr>
+          <w:sz w:val="24"/>
+          <w:szCs w:val="24"/>
+          <w:lang w:val="en-GB"/>
+        </w:rPr>
+      </w:pPr>
+      <w:r>
+        <w:rPr>
+          <w:sz w:val="24"/>
+          <w:szCs w:val="24"/>
+          <w:lang w:val="en-GB"/>
+        </w:rPr>
+        <w:t xml:space="preserve">System Testing: The complete system was tested on Linux environments with SCX support. </w:t>
+      </w:r>
+    </w:p>
+    <w:p>
+      <w:pPr>
+        <w:numPr>
+          <w:ilvl w:val="0"/>
+          <w:numId w:val="29"/>
+        </w:numPr>
+        <w:tabs>
+          <w:tab w:val="left" w:pos="720"/>
+        </w:tabs>
+        <w:jc w:val="both"/>
+        <w:rPr>
+          <w:sz w:val="24"/>
+          <w:szCs w:val="24"/>
+          <w:lang w:val="en-GB"/>
+        </w:rPr>
+      </w:pPr>
+      <w:r>
+        <w:rPr>
+          <w:sz w:val="24"/>
+          <w:szCs w:val="24"/>
+          <w:lang w:val="en-GB"/>
+        </w:rPr>
+        <w:t xml:space="preserve">Performance Testing: Different schedulers were compared using SuperTuxKart and rendering workloads. Metrics such as FPS, CPU usage, latency, and throughput were analyzed. </w:t>
+      </w:r>
+    </w:p>
+    <w:p>
+      <w:pPr>
+        <w:numPr>
+          <w:ilvl w:val="0"/>
+          <w:numId w:val="29"/>
+        </w:numPr>
+        <w:tabs>
+          <w:tab w:val="left" w:pos="720"/>
+        </w:tabs>
+        <w:jc w:val="both"/>
+        <w:rPr>
+          <w:sz w:val="24"/>
+          <w:szCs w:val="24"/>
+          <w:lang w:val="en-GB"/>
+        </w:rPr>
+      </w:pPr>
+      <w:r>
+        <w:rPr>
+          <w:sz w:val="24"/>
+          <w:szCs w:val="24"/>
+          <w:lang w:val="en-GB"/>
+        </w:rPr>
+        <w:t xml:space="preserve">Stress and Fault Tolerance Testing: Heavy workloads and scheduler crashes were simulated to verify recovery and fallback mechanisms. </w:t>
+      </w:r>
+    </w:p>
+    <w:p>
+      <w:pPr>
+        <w:numPr>
+          <w:ilvl w:val="0"/>
+          <w:numId w:val="29"/>
+        </w:numPr>
+        <w:tabs>
+          <w:tab w:val="left" w:pos="720"/>
+        </w:tabs>
+        <w:jc w:val="both"/>
+        <w:rPr>
+          <w:sz w:val="24"/>
+          <w:szCs w:val="24"/>
+          <w:lang w:val="en-GB"/>
+        </w:rPr>
+      </w:pPr>
+      <w:r>
+        <w:rPr>
+          <w:sz w:val="24"/>
+          <w:szCs w:val="24"/>
+          <w:lang w:val="en-GB"/>
+        </w:rPr>
+        <w:t xml:space="preserve">HCI/Usability Testing: The CLI interface, command clarity, and monitoring outputs were evaluated for usability. </w:t>
+      </w:r>
+    </w:p>
+    <w:p>
+      <w:pPr>
+        <w:numPr>
+          <w:ilvl w:val="0"/>
+          <w:numId w:val="29"/>
+        </w:numPr>
+        <w:tabs>
+          <w:tab w:val="left" w:pos="720"/>
+        </w:tabs>
+        <w:jc w:val="both"/>
+        <w:rPr>
+          <w:sz w:val="24"/>
+          <w:szCs w:val="24"/>
+          <w:lang w:val="en-GB"/>
+        </w:rPr>
+      </w:pPr>
+      <w:r>
+        <w:rPr>
+          <w:sz w:val="24"/>
+          <w:szCs w:val="24"/>
+          <w:lang w:val="en-GB"/>
+        </w:rPr>
+        <w:t xml:space="preserve">Alpha and Beta Testing: Internal alpha testing identified bugs and stability issues, while planned beta testing will gather feedback from advanced Linux users and researchers. </w:t>
+      </w:r>
+    </w:p>
+    <w:p>
+      <w:pPr>
+        <w:jc w:val="both"/>
+        <w:rPr>
+          <w:sz w:val="24"/>
+          <w:szCs w:val="24"/>
+          <w:lang w:val="en-GB"/>
+        </w:rPr>
+      </w:pPr>
+      <w:r>
+        <w:rPr>
+          <w:sz w:val="24"/>
+          <w:szCs w:val="24"/>
+          <w:lang w:val="en-GB"/>
+        </w:rPr>
+        <w:t>These testing procedures helped ensure stable and efficient scheduler performance under different workload conditions.</w:t>
       </w:r>
     </w:p>
     <w:p>
@@ -16773,11 +16900,11 @@
       </w:pPr>
     </w:p>
     <w:sectPr>
-      <w:headerReference w:type="even" r:id="rId21"/>
-      <w:headerReference w:type="default" r:id="rId22"/>
-      <w:footerReference w:type="default" r:id="rId23"/>
-      <w:headerReference w:type="first" r:id="rId24"/>
-      <w:footerReference w:type="first" r:id="rId25"/>
+      <w:headerReference w:type="even" r:id="rId22"/>
+      <w:headerReference w:type="default" r:id="rId23"/>
+      <w:footerReference w:type="default" r:id="rId24"/>
+      <w:headerReference w:type="first" r:id="rId25"/>
+      <w:footerReference w:type="first" r:id="rId26"/>
       <w:pgSz w:w="11906" w:h="16838"/>
       <w:pgMar w:top="1417" w:right="1417" w:bottom="1417" w:left="1417" w:header="708" w:footer="708" w:gutter="0"/>
       <w:cols w:space="708"/>
@@ -18244,6 +18371,155 @@
     </w:lvl>
   </w:abstractNum>
   <w:abstractNum w:abstractNumId="7" w15:restartNumberingAfterBreak="0">
+    <w:nsid w:val="207B5762"/>
+    <w:multiLevelType w:val="multilevel"/>
+    <w:tmpl w:val="4B3CBFE4"/>
+    <w:lvl w:ilvl="0">
+      <w:start w:val="1"/>
+      <w:numFmt w:val="bullet"/>
+      <w:lvlText w:val=""/>
+      <w:lvlJc w:val="left"/>
+      <w:pPr>
+        <w:tabs>
+          <w:tab w:val="num" w:pos="720"/>
+        </w:tabs>
+        <w:ind w:left="720" w:hanging="360"/>
+      </w:pPr>
+      <w:rPr>
+        <w:rFonts w:ascii="Symbol" w:hAnsi="Symbol" w:hint="default"/>
+        <w:sz w:val="20"/>
+      </w:rPr>
+    </w:lvl>
+    <w:lvl w:ilvl="1" w:tentative="1">
+      <w:start w:val="1"/>
+      <w:numFmt w:val="bullet"/>
+      <w:lvlText w:val="o"/>
+      <w:lvlJc w:val="left"/>
+      <w:pPr>
+        <w:tabs>
+          <w:tab w:val="num" w:pos="1440"/>
+        </w:tabs>
+        <w:ind w:left="1440" w:hanging="360"/>
+      </w:pPr>
+      <w:rPr>
+        <w:rFonts w:ascii="Courier New" w:hAnsi="Courier New" w:hint="default"/>
+        <w:sz w:val="20"/>
+      </w:rPr>
+    </w:lvl>
+    <w:lvl w:ilvl="2" w:tentative="1">
+      <w:start w:val="1"/>
+      <w:numFmt w:val="bullet"/>
+      <w:lvlText w:val=""/>
+      <w:lvlJc w:val="left"/>
+      <w:pPr>
+        <w:tabs>
+          <w:tab w:val="num" w:pos="2160"/>
+        </w:tabs>
+        <w:ind w:left="2160" w:hanging="360"/>
+      </w:pPr>
+      <w:rPr>
+        <w:rFonts w:ascii="Wingdings" w:hAnsi="Wingdings" w:hint="default"/>
+        <w:sz w:val="20"/>
+      </w:rPr>
+    </w:lvl>
+    <w:lvl w:ilvl="3" w:tentative="1">
+      <w:start w:val="1"/>
+      <w:numFmt w:val="bullet"/>
+      <w:lvlText w:val=""/>
+      <w:lvlJc w:val="left"/>
+      <w:pPr>
+        <w:tabs>
+          <w:tab w:val="num" w:pos="2880"/>
+        </w:tabs>
+        <w:ind w:left="2880" w:hanging="360"/>
+      </w:pPr>
+      <w:rPr>
+        <w:rFonts w:ascii="Wingdings" w:hAnsi="Wingdings" w:hint="default"/>
+        <w:sz w:val="20"/>
+      </w:rPr>
+    </w:lvl>
+    <w:lvl w:ilvl="4" w:tentative="1">
+      <w:start w:val="1"/>
+      <w:numFmt w:val="bullet"/>
+      <w:lvlText w:val=""/>
+      <w:lvlJc w:val="left"/>
+      <w:pPr>
+        <w:tabs>
+          <w:tab w:val="num" w:pos="3600"/>
+        </w:tabs>
+        <w:ind w:left="3600" w:hanging="360"/>
+      </w:pPr>
+      <w:rPr>
+        <w:rFonts w:ascii="Wingdings" w:hAnsi="Wingdings" w:hint="default"/>
+        <w:sz w:val="20"/>
+      </w:rPr>
+    </w:lvl>
+    <w:lvl w:ilvl="5" w:tentative="1">
+      <w:start w:val="1"/>
+      <w:numFmt w:val="bullet"/>
+      <w:lvlText w:val=""/>
+      <w:lvlJc w:val="left"/>
+      <w:pPr>
+        <w:tabs>
+          <w:tab w:val="num" w:pos="4320"/>
+        </w:tabs>
+        <w:ind w:left="4320" w:hanging="360"/>
+      </w:pPr>
+      <w:rPr>
+        <w:rFonts w:ascii="Wingdings" w:hAnsi="Wingdings" w:hint="default"/>
+        <w:sz w:val="20"/>
+      </w:rPr>
+    </w:lvl>
+    <w:lvl w:ilvl="6" w:tentative="1">
+      <w:start w:val="1"/>
+      <w:numFmt w:val="bullet"/>
+      <w:lvlText w:val=""/>
+      <w:lvlJc w:val="left"/>
+      <w:pPr>
+        <w:tabs>
+          <w:tab w:val="num" w:pos="5040"/>
+        </w:tabs>
+        <w:ind w:left="5040" w:hanging="360"/>
+      </w:pPr>
+      <w:rPr>
+        <w:rFonts w:ascii="Wingdings" w:hAnsi="Wingdings" w:hint="default"/>
+        <w:sz w:val="20"/>
+      </w:rPr>
+    </w:lvl>
+    <w:lvl w:ilvl="7" w:tentative="1">
+      <w:start w:val="1"/>
+      <w:numFmt w:val="bullet"/>
+      <w:lvlText w:val=""/>
+      <w:lvlJc w:val="left"/>
+      <w:pPr>
+        <w:tabs>
+          <w:tab w:val="num" w:pos="5760"/>
+        </w:tabs>
+        <w:ind w:left="5760" w:hanging="360"/>
+      </w:pPr>
+      <w:rPr>
+        <w:rFonts w:ascii="Wingdings" w:hAnsi="Wingdings" w:hint="default"/>
+        <w:sz w:val="20"/>
+      </w:rPr>
+    </w:lvl>
+    <w:lvl w:ilvl="8" w:tentative="1">
+      <w:start w:val="1"/>
+      <w:numFmt w:val="bullet"/>
+      <w:lvlText w:val=""/>
+      <w:lvlJc w:val="left"/>
+      <w:pPr>
+        <w:tabs>
+          <w:tab w:val="num" w:pos="6480"/>
+        </w:tabs>
+        <w:ind w:left="6480" w:hanging="360"/>
+      </w:pPr>
+      <w:rPr>
+        <w:rFonts w:ascii="Wingdings" w:hAnsi="Wingdings" w:hint="default"/>
+        <w:sz w:val="20"/>
+      </w:rPr>
+    </w:lvl>
+  </w:abstractNum>
+  <w:abstractNum w:abstractNumId="8" w15:restartNumberingAfterBreak="0">
     <w:nsid w:val="2A5C34DD"/>
     <w:multiLevelType w:val="multilevel"/>
     <w:tmpl w:val="A66E7C7E"/>
@@ -18330,7 +18606,7 @@
       </w:pPr>
     </w:lvl>
   </w:abstractNum>
-  <w:abstractNum w:abstractNumId="8" w15:restartNumberingAfterBreak="0">
+  <w:abstractNum w:abstractNumId="9" w15:restartNumberingAfterBreak="0">
     <w:nsid w:val="31D158FA"/>
     <w:multiLevelType w:val="multilevel"/>
     <w:tmpl w:val="900484B2"/>
@@ -18479,7 +18755,7 @@
       </w:rPr>
     </w:lvl>
   </w:abstractNum>
-  <w:abstractNum w:abstractNumId="9" w15:restartNumberingAfterBreak="0">
+  <w:abstractNum w:abstractNumId="10" w15:restartNumberingAfterBreak="0">
     <w:nsid w:val="351401DE"/>
     <w:multiLevelType w:val="multilevel"/>
     <w:tmpl w:val="7DB89520"/>
@@ -18628,7 +18904,7 @@
       </w:rPr>
     </w:lvl>
   </w:abstractNum>
-  <w:abstractNum w:abstractNumId="10" w15:restartNumberingAfterBreak="0">
+  <w:abstractNum w:abstractNumId="11" w15:restartNumberingAfterBreak="0">
     <w:nsid w:val="37212673"/>
     <w:multiLevelType w:val="multilevel"/>
     <w:tmpl w:val="87F89844"/>
@@ -18777,7 +19053,7 @@
       </w:rPr>
     </w:lvl>
   </w:abstractNum>
-  <w:abstractNum w:abstractNumId="11" w15:restartNumberingAfterBreak="0">
+  <w:abstractNum w:abstractNumId="12" w15:restartNumberingAfterBreak="0">
     <w:nsid w:val="373B123C"/>
     <w:multiLevelType w:val="multilevel"/>
     <w:tmpl w:val="274297C6"/>
@@ -18890,7 +19166,7 @@
       </w:pPr>
     </w:lvl>
   </w:abstractNum>
-  <w:abstractNum w:abstractNumId="12" w15:restartNumberingAfterBreak="0">
+  <w:abstractNum w:abstractNumId="13" w15:restartNumberingAfterBreak="0">
     <w:nsid w:val="375578BC"/>
     <w:multiLevelType w:val="multilevel"/>
     <w:tmpl w:val="274297C6"/>
@@ -19003,7 +19279,7 @@
       </w:pPr>
     </w:lvl>
   </w:abstractNum>
-  <w:abstractNum w:abstractNumId="13" w15:restartNumberingAfterBreak="0">
+  <w:abstractNum w:abstractNumId="14" w15:restartNumberingAfterBreak="0">
     <w:nsid w:val="3D383BFB"/>
     <w:multiLevelType w:val="hybridMultilevel"/>
     <w:tmpl w:val="D708F440"/>
@@ -19092,7 +19368,7 @@
       </w:pPr>
     </w:lvl>
   </w:abstractNum>
-  <w:abstractNum w:abstractNumId="14" w15:restartNumberingAfterBreak="0">
+  <w:abstractNum w:abstractNumId="15" w15:restartNumberingAfterBreak="0">
     <w:nsid w:val="3ED52559"/>
     <w:multiLevelType w:val="hybridMultilevel"/>
     <w:tmpl w:val="00DC421C"/>
@@ -19178,7 +19454,7 @@
       </w:pPr>
     </w:lvl>
   </w:abstractNum>
-  <w:abstractNum w:abstractNumId="15" w15:restartNumberingAfterBreak="0">
+  <w:abstractNum w:abstractNumId="16" w15:restartNumberingAfterBreak="0">
     <w:nsid w:val="46AA1FDF"/>
     <w:multiLevelType w:val="multilevel"/>
     <w:tmpl w:val="E9564446"/>
@@ -19267,7 +19543,7 @@
       </w:pPr>
     </w:lvl>
   </w:abstractNum>
-  <w:abstractNum w:abstractNumId="16" w15:restartNumberingAfterBreak="0">
+  <w:abstractNum w:abstractNumId="17" w15:restartNumberingAfterBreak="0">
     <w:nsid w:val="566248DF"/>
     <w:multiLevelType w:val="multilevel"/>
     <w:tmpl w:val="A4CCB68E"/>
@@ -19416,7 +19692,7 @@
       </w:rPr>
     </w:lvl>
   </w:abstractNum>
-  <w:abstractNum w:abstractNumId="17" w15:restartNumberingAfterBreak="0">
+  <w:abstractNum w:abstractNumId="18" w15:restartNumberingAfterBreak="0">
     <w:nsid w:val="583A62CE"/>
     <w:multiLevelType w:val="multilevel"/>
     <w:tmpl w:val="927416D6"/>
@@ -19502,7 +19778,7 @@
       </w:pPr>
     </w:lvl>
   </w:abstractNum>
-  <w:abstractNum w:abstractNumId="18" w15:restartNumberingAfterBreak="0">
+  <w:abstractNum w:abstractNumId="19" w15:restartNumberingAfterBreak="0">
     <w:nsid w:val="5CB5460E"/>
     <w:multiLevelType w:val="hybridMultilevel"/>
     <w:tmpl w:val="81DC75A4"/>
@@ -19615,7 +19891,7 @@
       </w:rPr>
     </w:lvl>
   </w:abstractNum>
-  <w:abstractNum w:abstractNumId="19" w15:restartNumberingAfterBreak="0">
+  <w:abstractNum w:abstractNumId="20" w15:restartNumberingAfterBreak="0">
     <w:nsid w:val="5DF831F0"/>
     <w:multiLevelType w:val="multilevel"/>
     <w:tmpl w:val="DDDAA5F4"/>
@@ -19764,7 +20040,7 @@
       </w:rPr>
     </w:lvl>
   </w:abstractNum>
-  <w:abstractNum w:abstractNumId="20" w15:restartNumberingAfterBreak="0">
+  <w:abstractNum w:abstractNumId="21" w15:restartNumberingAfterBreak="0">
     <w:nsid w:val="5E040726"/>
     <w:multiLevelType w:val="hybridMultilevel"/>
     <w:tmpl w:val="C4B4E8E8"/>
@@ -19853,7 +20129,7 @@
       </w:pPr>
     </w:lvl>
   </w:abstractNum>
-  <w:abstractNum w:abstractNumId="21" w15:restartNumberingAfterBreak="0">
+  <w:abstractNum w:abstractNumId="22" w15:restartNumberingAfterBreak="0">
     <w:nsid w:val="60C362F0"/>
     <w:multiLevelType w:val="multilevel"/>
     <w:tmpl w:val="D4626B30"/>
@@ -20002,7 +20278,7 @@
       </w:rPr>
     </w:lvl>
   </w:abstractNum>
-  <w:abstractNum w:abstractNumId="22" w15:restartNumberingAfterBreak="0">
+  <w:abstractNum w:abstractNumId="23" w15:restartNumberingAfterBreak="0">
     <w:nsid w:val="62F06D33"/>
     <w:multiLevelType w:val="multilevel"/>
     <w:tmpl w:val="38A8D8DC"/>
@@ -20088,7 +20364,7 @@
       </w:pPr>
     </w:lvl>
   </w:abstractNum>
-  <w:abstractNum w:abstractNumId="23" w15:restartNumberingAfterBreak="0">
+  <w:abstractNum w:abstractNumId="24" w15:restartNumberingAfterBreak="0">
     <w:nsid w:val="691339E0"/>
     <w:multiLevelType w:val="multilevel"/>
     <w:tmpl w:val="2D7EAC5A"/>
@@ -20174,7 +20450,7 @@
       </w:pPr>
     </w:lvl>
   </w:abstractNum>
-  <w:abstractNum w:abstractNumId="24" w15:restartNumberingAfterBreak="0">
+  <w:abstractNum w:abstractNumId="25" w15:restartNumberingAfterBreak="0">
     <w:nsid w:val="6E186C64"/>
     <w:multiLevelType w:val="hybridMultilevel"/>
     <w:tmpl w:val="0C928438"/>
@@ -20287,7 +20563,7 @@
       </w:rPr>
     </w:lvl>
   </w:abstractNum>
-  <w:abstractNum w:abstractNumId="25" w15:restartNumberingAfterBreak="0">
+  <w:abstractNum w:abstractNumId="26" w15:restartNumberingAfterBreak="0">
     <w:nsid w:val="6F95093C"/>
     <w:multiLevelType w:val="multilevel"/>
     <w:tmpl w:val="0D665868"/>
@@ -20373,7 +20649,7 @@
       </w:pPr>
     </w:lvl>
   </w:abstractNum>
-  <w:abstractNum w:abstractNumId="26" w15:restartNumberingAfterBreak="0">
+  <w:abstractNum w:abstractNumId="27" w15:restartNumberingAfterBreak="0">
     <w:nsid w:val="734E5905"/>
     <w:multiLevelType w:val="multilevel"/>
     <w:tmpl w:val="9C40DD6A"/>
@@ -20486,7 +20762,7 @@
       </w:pPr>
     </w:lvl>
   </w:abstractNum>
-  <w:abstractNum w:abstractNumId="27" w15:restartNumberingAfterBreak="0">
+  <w:abstractNum w:abstractNumId="28" w15:restartNumberingAfterBreak="0">
     <w:nsid w:val="7D6016DB"/>
     <w:multiLevelType w:val="multilevel"/>
     <w:tmpl w:val="0C44EC0A"/>
@@ -20636,64 +20912,64 @@
     </w:lvl>
   </w:abstractNum>
   <w:num w:numId="1" w16cid:durableId="525675974">
-    <w:abstractNumId w:val="7"/>
+    <w:abstractNumId w:val="8"/>
   </w:num>
   <w:num w:numId="2" w16cid:durableId="2024891529">
-    <w:abstractNumId w:val="17"/>
+    <w:abstractNumId w:val="18"/>
   </w:num>
   <w:num w:numId="3" w16cid:durableId="1475829003">
     <w:abstractNumId w:val="6"/>
   </w:num>
   <w:num w:numId="4" w16cid:durableId="1477720559">
-    <w:abstractNumId w:val="25"/>
+    <w:abstractNumId w:val="26"/>
   </w:num>
   <w:num w:numId="5" w16cid:durableId="1346402515">
     <w:abstractNumId w:val="1"/>
   </w:num>
   <w:num w:numId="6" w16cid:durableId="1305619511">
-    <w:abstractNumId w:val="23"/>
+    <w:abstractNumId w:val="24"/>
   </w:num>
   <w:num w:numId="7" w16cid:durableId="1121729500">
-    <w:abstractNumId w:val="15"/>
+    <w:abstractNumId w:val="16"/>
   </w:num>
   <w:num w:numId="8" w16cid:durableId="476731481">
-    <w:abstractNumId w:val="22"/>
+    <w:abstractNumId w:val="23"/>
   </w:num>
   <w:num w:numId="9" w16cid:durableId="1554579648">
     <w:abstractNumId w:val="5"/>
   </w:num>
   <w:num w:numId="10" w16cid:durableId="2008361062">
-    <w:abstractNumId w:val="12"/>
+    <w:abstractNumId w:val="13"/>
   </w:num>
   <w:num w:numId="11" w16cid:durableId="1804958309">
-    <w:abstractNumId w:val="27"/>
+    <w:abstractNumId w:val="28"/>
   </w:num>
   <w:num w:numId="12" w16cid:durableId="996610436">
     <w:abstractNumId w:val="2"/>
   </w:num>
   <w:num w:numId="13" w16cid:durableId="1376157146">
-    <w:abstractNumId w:val="24"/>
+    <w:abstractNumId w:val="25"/>
   </w:num>
   <w:num w:numId="14" w16cid:durableId="245656035">
     <w:abstractNumId w:val="4"/>
   </w:num>
   <w:num w:numId="15" w16cid:durableId="1599560401">
-    <w:abstractNumId w:val="18"/>
+    <w:abstractNumId w:val="19"/>
   </w:num>
   <w:num w:numId="16" w16cid:durableId="1099642600">
-    <w:abstractNumId w:val="21"/>
+    <w:abstractNumId w:val="22"/>
   </w:num>
   <w:num w:numId="17" w16cid:durableId="11346324">
-    <w:abstractNumId w:val="8"/>
+    <w:abstractNumId w:val="9"/>
   </w:num>
   <w:num w:numId="18" w16cid:durableId="1786731371">
-    <w:abstractNumId w:val="16"/>
+    <w:abstractNumId w:val="17"/>
   </w:num>
   <w:num w:numId="19" w16cid:durableId="2094012595">
-    <w:abstractNumId w:val="19"/>
+    <w:abstractNumId w:val="20"/>
   </w:num>
   <w:num w:numId="20" w16cid:durableId="713694169">
-    <w:abstractNumId w:val="9"/>
+    <w:abstractNumId w:val="10"/>
   </w:num>
   <w:num w:numId="21" w16cid:durableId="1098212235">
     <w:abstractNumId w:val="3"/>
@@ -20702,22 +20978,25 @@
     <w:abstractNumId w:val="0"/>
   </w:num>
   <w:num w:numId="23" w16cid:durableId="1933976042">
-    <w:abstractNumId w:val="10"/>
+    <w:abstractNumId w:val="11"/>
   </w:num>
   <w:num w:numId="24" w16cid:durableId="1221089325">
-    <w:abstractNumId w:val="11"/>
+    <w:abstractNumId w:val="12"/>
   </w:num>
   <w:num w:numId="25" w16cid:durableId="1087921125">
-    <w:abstractNumId w:val="13"/>
+    <w:abstractNumId w:val="14"/>
   </w:num>
   <w:num w:numId="26" w16cid:durableId="1945576675">
-    <w:abstractNumId w:val="14"/>
+    <w:abstractNumId w:val="15"/>
   </w:num>
   <w:num w:numId="27" w16cid:durableId="1150293268">
-    <w:abstractNumId w:val="20"/>
+    <w:abstractNumId w:val="21"/>
   </w:num>
   <w:num w:numId="28" w16cid:durableId="1978490048">
-    <w:abstractNumId w:val="26"/>
+    <w:abstractNumId w:val="27"/>
+  </w:num>
+  <w:num w:numId="29" w16cid:durableId="514468035">
+    <w:abstractNumId w:val="7"/>
   </w:num>
 </w:numbering>
 </file>
@@ -21337,7 +21616,6 @@
   <w:style w:type="character" w:default="1" w:styleId="DefaultParagraphFont">
     <w:name w:val="Default Paragraph Font"/>
     <w:uiPriority w:val="1"/>
-    <w:semiHidden/>
     <w:unhideWhenUsed/>
   </w:style>
   <w:style w:type="table" w:default="1" w:styleId="TableNormal">

</xml_diff>

<commit_message>
Updated report and visualizations
</commit_message>
<xml_diff>
--- a/documents/SENG BİTİRME PROJESİ RAPOR TASLAĞI.docx
+++ b/documents/SENG BİTİRME PROJESİ RAPOR TASLAĞI.docx
@@ -13065,6 +13065,7 @@
         <w:rPr>
           <w:rFonts w:ascii="Times New Roman" w:eastAsia="Times New Roman" w:hAnsi="Times New Roman" w:cs="Times New Roman"/>
           <w:i/>
+          <w:noProof/>
           <w:color w:val="000000"/>
           <w:sz w:val="24"/>
           <w:szCs w:val="24"/>
@@ -13641,6 +13642,137 @@
         </w:rPr>
         <w:t>Give a general evaluation (performance, problems and so on) of your system.</w:t>
       </w:r>
+    </w:p>
+    <w:p>
+      <w:pPr>
+        <w:jc w:val="both"/>
+      </w:pPr>
+      <w:r>
+        <w:drawing>
+          <wp:inline distT="0" distB="0" distL="0" distR="0" wp14:anchorId="1CB01148" wp14:editId="14D56241">
+            <wp:extent cx="5760720" cy="3112770"/>
+            <wp:effectExtent l="0" t="0" r="0" b="0"/>
+            <wp:docPr id="148611903" name="Picture 1"/>
+            <wp:cNvGraphicFramePr>
+              <a:graphicFrameLocks xmlns:a="http://schemas.openxmlformats.org/drawingml/2006/main" noChangeAspect="1"/>
+            </wp:cNvGraphicFramePr>
+            <a:graphic xmlns:a="http://schemas.openxmlformats.org/drawingml/2006/main">
+              <a:graphicData uri="http://schemas.openxmlformats.org/drawingml/2006/picture">
+                <pic:pic xmlns:pic="http://schemas.openxmlformats.org/drawingml/2006/picture">
+                  <pic:nvPicPr>
+                    <pic:cNvPr id="148611903" name=""/>
+                    <pic:cNvPicPr/>
+                  </pic:nvPicPr>
+                  <pic:blipFill>
+                    <a:blip r:embed="rId22"/>
+                    <a:stretch>
+                      <a:fillRect/>
+                    </a:stretch>
+                  </pic:blipFill>
+                  <pic:spPr>
+                    <a:xfrm>
+                      <a:off x="0" y="0"/>
+                      <a:ext cx="5760720" cy="3112770"/>
+                    </a:xfrm>
+                    <a:prstGeom prst="rect">
+                      <a:avLst/>
+                    </a:prstGeom>
+                  </pic:spPr>
+                </pic:pic>
+              </a:graphicData>
+            </a:graphic>
+          </wp:inline>
+        </w:drawing>
+      </w:r>
+    </w:p>
+    <w:p>
+      <w:pPr>
+        <w:jc w:val="both"/>
+      </w:pPr>
+      <w:r>
+        <w:drawing>
+          <wp:inline distT="0" distB="0" distL="0" distR="0" wp14:anchorId="250EAEB6" wp14:editId="2AEB630F">
+            <wp:extent cx="5760720" cy="3110865"/>
+            <wp:effectExtent l="0" t="0" r="0" b="0"/>
+            <wp:docPr id="27350503" name="Picture 1"/>
+            <wp:cNvGraphicFramePr>
+              <a:graphicFrameLocks xmlns:a="http://schemas.openxmlformats.org/drawingml/2006/main" noChangeAspect="1"/>
+            </wp:cNvGraphicFramePr>
+            <a:graphic xmlns:a="http://schemas.openxmlformats.org/drawingml/2006/main">
+              <a:graphicData uri="http://schemas.openxmlformats.org/drawingml/2006/picture">
+                <pic:pic xmlns:pic="http://schemas.openxmlformats.org/drawingml/2006/picture">
+                  <pic:nvPicPr>
+                    <pic:cNvPr id="27350503" name=""/>
+                    <pic:cNvPicPr/>
+                  </pic:nvPicPr>
+                  <pic:blipFill>
+                    <a:blip r:embed="rId23"/>
+                    <a:stretch>
+                      <a:fillRect/>
+                    </a:stretch>
+                  </pic:blipFill>
+                  <pic:spPr>
+                    <a:xfrm>
+                      <a:off x="0" y="0"/>
+                      <a:ext cx="5760720" cy="3110865"/>
+                    </a:xfrm>
+                    <a:prstGeom prst="rect">
+                      <a:avLst/>
+                    </a:prstGeom>
+                  </pic:spPr>
+                </pic:pic>
+              </a:graphicData>
+            </a:graphic>
+          </wp:inline>
+        </w:drawing>
+      </w:r>
+    </w:p>
+    <w:p>
+      <w:pPr>
+        <w:jc w:val="both"/>
+        <w:rPr>
+          <w:sz w:val="24"/>
+          <w:szCs w:val="24"/>
+        </w:rPr>
+      </w:pPr>
+      <w:r>
+        <w:lastRenderedPageBreak/>
+        <w:drawing>
+          <wp:inline distT="0" distB="0" distL="0" distR="0" wp14:anchorId="39C31C89" wp14:editId="237D49DA">
+            <wp:extent cx="5760720" cy="3106420"/>
+            <wp:effectExtent l="0" t="0" r="0" b="0"/>
+            <wp:docPr id="1849294370" name="Picture 1"/>
+            <wp:cNvGraphicFramePr>
+              <a:graphicFrameLocks xmlns:a="http://schemas.openxmlformats.org/drawingml/2006/main" noChangeAspect="1"/>
+            </wp:cNvGraphicFramePr>
+            <a:graphic xmlns:a="http://schemas.openxmlformats.org/drawingml/2006/main">
+              <a:graphicData uri="http://schemas.openxmlformats.org/drawingml/2006/picture">
+                <pic:pic xmlns:pic="http://schemas.openxmlformats.org/drawingml/2006/picture">
+                  <pic:nvPicPr>
+                    <pic:cNvPr id="1849294370" name=""/>
+                    <pic:cNvPicPr/>
+                  </pic:nvPicPr>
+                  <pic:blipFill>
+                    <a:blip r:embed="rId24"/>
+                    <a:stretch>
+                      <a:fillRect/>
+                    </a:stretch>
+                  </pic:blipFill>
+                  <pic:spPr>
+                    <a:xfrm>
+                      <a:off x="0" y="0"/>
+                      <a:ext cx="5760720" cy="3106420"/>
+                    </a:xfrm>
+                    <a:prstGeom prst="rect">
+                      <a:avLst/>
+                    </a:prstGeom>
+                  </pic:spPr>
+                </pic:pic>
+              </a:graphicData>
+            </a:graphic>
+          </wp:inline>
+        </w:drawing>
+      </w:r>
       <w:r>
         <w:br w:type="page"/>
       </w:r>
@@ -16900,11 +17032,11 @@
       </w:pPr>
     </w:p>
     <w:sectPr>
-      <w:headerReference w:type="even" r:id="rId22"/>
-      <w:headerReference w:type="default" r:id="rId23"/>
-      <w:footerReference w:type="default" r:id="rId24"/>
-      <w:headerReference w:type="first" r:id="rId25"/>
-      <w:footerReference w:type="first" r:id="rId26"/>
+      <w:headerReference w:type="even" r:id="rId25"/>
+      <w:headerReference w:type="default" r:id="rId26"/>
+      <w:footerReference w:type="default" r:id="rId27"/>
+      <w:headerReference w:type="first" r:id="rId28"/>
+      <w:footerReference w:type="first" r:id="rId29"/>
       <w:pgSz w:w="11906" w:h="16838"/>
       <w:pgMar w:top="1417" w:right="1417" w:bottom="1417" w:left="1417" w:header="708" w:footer="708" w:gutter="0"/>
       <w:cols w:space="708"/>
@@ -21616,6 +21748,7 @@
   <w:style w:type="character" w:default="1" w:styleId="DefaultParagraphFont">
     <w:name w:val="Default Paragraph Font"/>
     <w:uiPriority w:val="1"/>
+    <w:semiHidden/>
     <w:unhideWhenUsed/>
   </w:style>
   <w:style w:type="table" w:default="1" w:styleId="TableNormal">
@@ -23057,15 +23190,6 @@
 </file>
 
 <file path=customXml/item1.xml><?xml version="1.0" encoding="utf-8"?>
-<?mso-contentType ?>
-<FormTemplates xmlns="http://schemas.microsoft.com/sharepoint/v3/contenttype/forms">
-  <Display>DocumentLibraryForm</Display>
-  <Edit>DocumentLibraryForm</Edit>
-  <New>DocumentLibraryForm</New>
-</FormTemplates>
-</file>
-
-<file path=customXml/item2.xml><?xml version="1.0" encoding="utf-8"?>
 <p:properties xmlns:p="http://schemas.microsoft.com/office/2006/metadata/properties" xmlns:xsi="http://www.w3.org/2001/XMLSchema-instance" xmlns:pc="http://schemas.microsoft.com/office/infopath/2007/PartnerControls">
   <documentManagement>
     <lcf76f155ced4ddcb4097134ff3c332f xmlns="7e9bba26-c7b2-4a27-a3ac-cd76b284cae0">
@@ -23076,13 +23200,16 @@
 </p:properties>
 </file>
 
-<file path=customXml/item3.xml><?xml version="1.0" encoding="utf-8"?>
-<go:gDocsCustomXmlDataStorage xmlns:go="http://customooxmlschemas.google.com/" xmlns:r="http://schemas.openxmlformats.org/officeDocument/2006/relationships" uri="GoogleDocsCustomDataVersion2">
-  <go:docsCustomData xmlns:go="http://customooxmlschemas.google.com/" roundtripDataSignature="AMtx7mjWy5EO6kt5atv+NXw3Gu3Sl74eEA==">CgMxLjA4AHIhMWgzWVFPeDRiaDdneGFvQmZGdkUzUnk1V2w0QTd4VW0x</go:docsCustomData>
-</go:gDocsCustomXmlDataStorage>
+<file path=customXml/item2.xml><?xml version="1.0" encoding="utf-8"?>
+<?mso-contentType ?>
+<FormTemplates xmlns="http://schemas.microsoft.com/sharepoint/v3/contenttype/forms">
+  <Display>DocumentLibraryForm</Display>
+  <Edit>DocumentLibraryForm</Edit>
+  <New>DocumentLibraryForm</New>
+</FormTemplates>
 </file>
 
-<file path=customXml/item4.xml><?xml version="1.0" encoding="utf-8"?>
+<file path=customXml/item3.xml><?xml version="1.0" encoding="utf-8"?>
 <ct:contentTypeSchema xmlns:ct="http://schemas.microsoft.com/office/2006/metadata/contentType" xmlns:ma="http://schemas.microsoft.com/office/2006/metadata/properties/metaAttributes" ct:_="" ma:_="" ma:contentTypeName="Belge" ma:contentTypeID="0x010100A2D9663D32F195478084E660A9F44C9E" ma:contentTypeVersion="10" ma:contentTypeDescription="Yeni belge oluşturun." ma:contentTypeScope="" ma:versionID="6d98bf1c7ffb5fb69278a9c6338486c7">
   <xsd:schema xmlns:xsd="http://www.w3.org/2001/XMLSchema" xmlns:xs="http://www.w3.org/2001/XMLSchema" xmlns:p="http://schemas.microsoft.com/office/2006/metadata/properties" xmlns:ns2="7e9bba26-c7b2-4a27-a3ac-cd76b284cae0" xmlns:ns3="f76e5be2-97eb-4a1b-ab44-72f8057eaa93" targetNamespace="http://schemas.microsoft.com/office/2006/metadata/properties" ma:root="true" ma:fieldsID="508632a5764188408bb22ca1c81e76c3" ns2:_="" ns3:_="">
     <xsd:import namespace="7e9bba26-c7b2-4a27-a3ac-cd76b284cae0"/>
@@ -23271,15 +23398,13 @@
 </ct:contentTypeSchema>
 </file>
 
-<file path=customXml/itemProps1.xml><?xml version="1.0" encoding="utf-8"?>
-<ds:datastoreItem xmlns:ds="http://schemas.openxmlformats.org/officeDocument/2006/customXml" ds:itemID="{E746D0E6-B458-4401-BBA2-205116D38250}">
-  <ds:schemaRefs>
-    <ds:schemaRef ds:uri="http://schemas.microsoft.com/sharepoint/v3/contenttype/forms"/>
-  </ds:schemaRefs>
-</ds:datastoreItem>
+<file path=customXml/item4.xml><?xml version="1.0" encoding="utf-8"?>
+<go:gDocsCustomXmlDataStorage xmlns:go="http://customooxmlschemas.google.com/" xmlns:r="http://schemas.openxmlformats.org/officeDocument/2006/relationships" uri="GoogleDocsCustomDataVersion2">
+  <go:docsCustomData xmlns:go="http://customooxmlschemas.google.com/" roundtripDataSignature="AMtx7mjWy5EO6kt5atv+NXw3Gu3Sl74eEA==">CgMxLjA4AHIhMWgzWVFPeDRiaDdneGFvQmZGdkUzUnk1V2w0QTd4VW0x</go:docsCustomData>
+</go:gDocsCustomXmlDataStorage>
 </file>
 
-<file path=customXml/itemProps2.xml><?xml version="1.0" encoding="utf-8"?>
+<file path=customXml/itemProps1.xml><?xml version="1.0" encoding="utf-8"?>
 <ds:datastoreItem xmlns:ds="http://schemas.openxmlformats.org/officeDocument/2006/customXml" ds:itemID="{E5F80975-576A-46B4-A30D-917CC465C2C2}">
   <ds:schemaRefs>
     <ds:schemaRef ds:uri="http://schemas.microsoft.com/office/2006/metadata/properties"/>
@@ -23290,16 +23415,15 @@
 </ds:datastoreItem>
 </file>
 
-<file path=customXml/itemProps3.xml><?xml version="1.0" encoding="utf-8"?>
-<ds:datastoreItem xmlns:ds="http://schemas.openxmlformats.org/officeDocument/2006/customXml" ds:itemID="{11111111-1234-1234-1234-123412341234}">
+<file path=customXml/itemProps2.xml><?xml version="1.0" encoding="utf-8"?>
+<ds:datastoreItem xmlns:ds="http://schemas.openxmlformats.org/officeDocument/2006/customXml" ds:itemID="{E746D0E6-B458-4401-BBA2-205116D38250}">
   <ds:schemaRefs>
-    <ds:schemaRef ds:uri="http://customooxmlschemas.google.com/"/>
-    <ds:schemaRef ds:uri="http://schemas.openxmlformats.org/officeDocument/2006/relationships"/>
+    <ds:schemaRef ds:uri="http://schemas.microsoft.com/sharepoint/v3/contenttype/forms"/>
   </ds:schemaRefs>
 </ds:datastoreItem>
 </file>
 
-<file path=customXml/itemProps4.xml><?xml version="1.0" encoding="utf-8"?>
+<file path=customXml/itemProps3.xml><?xml version="1.0" encoding="utf-8"?>
 <ds:datastoreItem xmlns:ds="http://schemas.openxmlformats.org/officeDocument/2006/customXml" ds:itemID="{F9C39193-FFC5-4D89-94FB-36EF51BE6022}">
   <ds:schemaRefs>
     <ds:schemaRef ds:uri="http://schemas.microsoft.com/office/2006/metadata/contentType"/>
@@ -23316,4 +23440,13 @@
     <ds:schemaRef ds:uri="http://schemas.microsoft.com/internal/obd"/>
   </ds:schemaRefs>
 </ds:datastoreItem>
+</file>
+
+<file path=customXml/itemProps4.xml><?xml version="1.0" encoding="utf-8"?>
+<ds:datastoreItem xmlns:ds="http://schemas.openxmlformats.org/officeDocument/2006/customXml" ds:itemID="{11111111-1234-1234-1234-123412341234}">
+  <ds:schemaRefs>
+    <ds:schemaRef ds:uri="http://customooxmlschemas.google.com/"/>
+    <ds:schemaRef ds:uri="http://schemas.openxmlformats.org/officeDocument/2006/relationships"/>
+  </ds:schemaRefs>
+</ds:datastoreItem>
 </file>
</xml_diff>